<commit_message>
Add "Problems of Confusion" artifact and update reflection
Added a new artifact card for "Problems of Confusion and Clear Communication in Leadership" to artifacts.html, linking to a newly rewritten problem-of-confusion.html page and updated DOCX file. The detail page now focuses on leadership communication, real-life and biblical examples, and practical strategies, replacing previous neural network analogy content. Updated AI tool disclosure, learning outcomes, and course context to align with the new reflection.
</commit_message>
<xml_diff>
--- a/problems-of-confusion.docx
+++ b/problems-of-confusion.docx
@@ -3,38 +3,8 @@
 <w:document xmlns:wpc="http://schemas.microsoft.com/office/word/2010/wordprocessingCanvas" xmlns:cx="http://schemas.microsoft.com/office/drawing/2014/chartex" xmlns:cx1="http://schemas.microsoft.com/office/drawing/2015/9/8/chartex" xmlns:cx2="http://schemas.microsoft.com/office/drawing/2015/10/21/chartex" xmlns:cx3="http://schemas.microsoft.com/office/drawing/2016/5/9/chartex" xmlns:cx4="http://schemas.microsoft.com/office/drawing/2016/5/10/chartex" xmlns:cx5="http://schemas.microsoft.com/office/drawing/2016/5/11/chartex" xmlns:cx6="http://schemas.microsoft.com/office/drawing/2016/5/12/chartex" xmlns:cx7="http://schemas.microsoft.com/office/drawing/2016/5/13/chartex" xmlns:cx8="http://schemas.microsoft.com/office/drawing/2016/5/14/chartex" xmlns:mc="http://schemas.openxmlformats.org/markup-compatibility/2006" xmlns:aink="http://schemas.microsoft.com/office/drawing/2016/ink" xmlns:am3d="http://schemas.microsoft.com/office/drawing/2017/model3d" xmlns:o="urn:schemas-microsoft-com:office:office" xmlns:oel="http://schemas.microsoft.com/office/2019/extlst" xmlns:r="http://schemas.openxmlformats.org/officeDocument/2006/relationships" xmlns:m="http://schemas.openxmlformats.org/officeDocument/2006/math" xmlns:v="urn:schemas-microsoft-com:vml" xmlns:wp14="http://schemas.microsoft.com/office/word/2010/wordprocessingDrawing" xmlns:wp="http://schemas.openxmlformats.org/drawingml/2006/wordprocessingDrawing" xmlns:w10="urn:schemas-microsoft-com:office:word" xmlns:w="http://schemas.openxmlformats.org/wordprocessingml/2006/main" xmlns:w14="http://schemas.microsoft.com/office/word/2010/wordml" xmlns:w15="http://schemas.microsoft.com/office/word/2012/wordml" xmlns:w16cex="http://schemas.microsoft.com/office/word/2018/wordml/cex" xmlns:w16cid="http://schemas.microsoft.com/office/word/2016/wordml/cid" xmlns:w16="http://schemas.microsoft.com/office/word/2018/wordml" xmlns:w16du="http://schemas.microsoft.com/office/word/2023/wordml/word16du" xmlns:w16sdtdh="http://schemas.microsoft.com/office/word/2020/wordml/sdtdatahash" xmlns:w16sdtfl="http://schemas.microsoft.com/office/word/2024/wordml/sdtformatlock" xmlns:w16se="http://schemas.microsoft.com/office/word/2015/wordml/symex" xmlns:wpg="http://schemas.microsoft.com/office/word/2010/wordprocessingGroup" xmlns:wpi="http://schemas.microsoft.com/office/word/2010/wordprocessingInk" xmlns:wne="http://schemas.microsoft.com/office/word/2006/wordml" xmlns:wps="http://schemas.microsoft.com/office/word/2010/wordprocessingShape" mc:Ignorable="w14 w15 w16se w16cid w16 w16cex w16sdtdh w16sdtfl w16du wp14">
   <w:body>
     <w:p>
-      <w:r>
-        <w:rPr>
-          <w:b/>
-          <w:bCs/>
-        </w:rPr>
-        <w:t>4.1 Problems of Confusion</w:t>
-      </w:r>
-      <w:r>
-        <w:br/>
-        <w:t>Killamsetti, Tirumala Raju</w:t>
-      </w:r>
-      <w:r>
-        <w:br/>
-        <w:t>Foundations of Machine Learning</w:t>
-      </w:r>
-      <w:r>
-        <w:br/>
-        <w:t>Instructor: Dr. Longe</w:t>
-      </w:r>
-      <w:r>
-        <w:br/>
-        <w:t>April 0</w:t>
-      </w:r>
-      <w:r>
-        <w:t>8</w:t>
-      </w:r>
-      <w:r>
-        <w:t>, 2026</w:t>
-      </w:r>
-    </w:p>
-    <w:p>
       <w:pPr>
+        <w:jc w:val="center"/>
         <w:rPr>
           <w:sz w:val="28"/>
           <w:szCs w:val="28"/>
@@ -57,6 +27,18 @@
           <w:bCs/>
         </w:rPr>
       </w:pPr>
+      <w:r>
+        <w:rPr>
+          <w:b/>
+          <w:bCs/>
+        </w:rPr>
+        <w:t>Reflecting on My Communication Style</w:t>
+      </w:r>
+    </w:p>
+    <w:p>
+      <w:r>
+        <w:t>Clear communication is something I am still working on. Sometimes I assume people understand what I mean, but my instructions are not always clear. I usually explain the main idea but forget to explain the steps. This can cause confusion, especially in team work. In 1 Corinthians 14:8–9, Paul explains that if the message is not clear, people will not know what to do. This reminds me that leaders must communicate in a simple and understandable way. I need to slow down, explain clearly, and check if others understand. I can do this by summarizing tasks, asking questions, and confirming understanding.</w:t>
+      </w:r>
     </w:p>
     <w:p>
       <w:pPr>
@@ -70,12 +52,12 @@
           <w:b/>
           <w:bCs/>
         </w:rPr>
-        <w:t>Reflecting on My Communication Style</w:t>
-      </w:r>
-    </w:p>
-    <w:p>
-      <w:r>
-        <w:t>Clear communication is something I am still working on. Sometimes I assume people understand what I mean, but my instructions are not always clear. I usually explain the main idea but forget to explain the steps. This can cause confusion, especially in team work. In 1 Corinthians 14:8–9, Paul explains that if the message is not clear, people will not know what to do. This reminds me that leaders must communicate in a simple and understandable way. I need to slow down, explain clearly, and check if others understand. I can do this by summarizing tasks, asking questions, and confirming understanding.</w:t>
+        <w:t>Ensuring Team Alignment and Understanding</w:t>
+      </w:r>
+    </w:p>
+    <w:p>
+      <w:r>
+        <w:t>To make sure my team understands, I think it helps to communicate in different ways. Some people like examples, while others prefer written instructions. For example, in a group project, instead of just saying train the model, I can explain steps, assign roles, and give a checklist. I can also ask team members to explain their part. This helps find confusion early. Another helpful idea is using a shared document that lists goals and responsibilities. This keeps everyone on the same page and reduce misunderstandings.</w:t>
       </w:r>
     </w:p>
     <w:p>
@@ -90,12 +72,12 @@
           <w:b/>
           <w:bCs/>
         </w:rPr>
-        <w:t>Ensuring Team Alignment and Understanding</w:t>
-      </w:r>
-    </w:p>
-    <w:p>
-      <w:r>
-        <w:t>To make sure my team understands, I think it helps to communicate in different ways. Some people like examples, while others prefer written instructions. For example, in a group project, instead of just saying train the model, I can explain steps, assign roles, and give a checklist. I can also ask team members to explain their part. This helps find confusion early. Another helpful idea is using a shared document that lists goals and responsibilities. This keeps everyone on the same page and reduce misunderstandings.</w:t>
+        <w:t>Example of Confusion from Poor Communication</w:t>
+      </w:r>
+    </w:p>
+    <w:p>
+      <w:r>
+        <w:t>One example of confusion I experienced was during a group assignment. The team leader said everyone finish your part by Friday, but did not explain what each person part was. One student worked on slides, another started writing the report, and I began collecting data. We all thought we were doing the right thing, but when we met again, we realized we missed important sections like introduction and conclusion. Some parts were repeated and other parts were missing. This created stress and we had to rush at the last minute. The problem was not effort, it was unclear communication. If roles and tasks were explained more clearly, the confusion could of been avoided.</w:t>
       </w:r>
     </w:p>
     <w:p>
@@ -110,12 +92,12 @@
           <w:b/>
           <w:bCs/>
         </w:rPr>
-        <w:t>Example of Confusion from Poor Communication</w:t>
-      </w:r>
-    </w:p>
-    <w:p>
-      <w:r>
-        <w:t>One example of confusion I experienced was during a group assignment. The team leader said everyone finish your part by Friday, but did not explain what each person part was. One student worked on slides, another started writing the report, and I began collecting data. We all thought we were doing the right thing, but when we met again, we realized we missed important sections like introduction and conclusion. Some parts were repeated and other parts were missing. This created stress and we had to rush at the last minute. The problem was not effort, it was unclear communication. If roles and tasks were explained more clearly, the confusion could of been avoided.</w:t>
+        <w:t>The Tower of Babel and Consequences of Confusion</w:t>
+      </w:r>
+    </w:p>
+    <w:p>
+      <w:r>
+        <w:t>The story of the Tower of Babel shows how confusion can stop progress. When people shared one language, they worked together effectively. Once their language was confused, they could not understand each other and the work stopped (Genesis 11:6–7, New International Version). This shows how important clear communication is for teamwork. When people do not understand each other, even strong teams struggle. In real life, this can happen in workplaces when instructions are unclear or teams are not aligned. Without clarity, people start moving in different directions and progress slows down.</w:t>
       </w:r>
     </w:p>
     <w:p>
@@ -130,27 +112,7 @@
           <w:b/>
           <w:bCs/>
         </w:rPr>
-        <w:t>The Tower of Babel and Consequences of Confusion</w:t>
-      </w:r>
-    </w:p>
-    <w:p>
-      <w:r>
         <w:lastRenderedPageBreak/>
-        <w:t>The story of the Tower of Babel shows how confusion can stop progress. When people shared one language, they worked together effectively. Once their language was confused, they could not understand each other and the work stopped (Genesis 11:6–7, New International Version). This shows how important clear communication is for teamwork. When people do not understand each other, even strong teams struggle. In real life, this can happen in workplaces when instructions are unclear or teams are not aligned. Without clarity, people start moving in different directions and progress slows down.</w:t>
-      </w:r>
-    </w:p>
-    <w:p>
-      <w:pPr>
-        <w:rPr>
-          <w:b/>
-          <w:bCs/>
-        </w:rPr>
-      </w:pPr>
-      <w:r>
-        <w:rPr>
-          <w:b/>
-          <w:bCs/>
-        </w:rPr>
         <w:t>Listening and Clarifying to Reduce Confusion</w:t>
       </w:r>
     </w:p>
@@ -813,6 +775,7 @@
   <w:style w:type="character" w:default="1" w:styleId="DefaultParagraphFont">
     <w:name w:val="Default Paragraph Font"/>
     <w:uiPriority w:val="1"/>
+    <w:semiHidden/>
     <w:unhideWhenUsed/>
   </w:style>
   <w:style w:type="table" w:default="1" w:styleId="TableNormal">

</xml_diff>